<commit_message>
Set point color to black, Removed useless code
</commit_message>
<xml_diff>
--- a/Lab 2/Лаб2_IМ51_Вітер.docx
+++ b/Lab 2/Лаб2_IМ51_Вітер.docx
@@ -15727,82 +15727,6 @@
           <w:highlight w:val="white"/>
         </w:rPr>
         <w:tab/>
-        <w:tab/>
-        <w:t>InvalidateRect(</w:t>
-      </w:r>
-      <w:r>
-        <w:rPr>
-          <w:rFonts w:ascii="Cascadia Mono" w:hAnsi="Cascadia Mono"/>
-          <w:color w:val="808080"/>
-          <w:sz w:val="19"/>
-          <w:highlight w:val="white"/>
-        </w:rPr>
-        <w:t>hWnd</w:t>
-      </w:r>
-      <w:r>
-        <w:rPr>
-          <w:rFonts w:ascii="Cascadia Mono" w:hAnsi="Cascadia Mono"/>
-          <w:color w:val="000000"/>
-          <w:sz w:val="19"/>
-          <w:highlight w:val="white"/>
-        </w:rPr>
-        <w:t xml:space="preserve">, </w:t>
-      </w:r>
-      <w:r>
-        <w:rPr>
-          <w:rFonts w:ascii="Cascadia Mono" w:hAnsi="Cascadia Mono"/>
-          <w:color w:val="0000FF"/>
-          <w:sz w:val="19"/>
-          <w:highlight w:val="white"/>
-        </w:rPr>
-        <w:t>nullptr</w:t>
-      </w:r>
-      <w:r>
-        <w:rPr>
-          <w:rFonts w:ascii="Cascadia Mono" w:hAnsi="Cascadia Mono"/>
-          <w:color w:val="000000"/>
-          <w:sz w:val="19"/>
-          <w:highlight w:val="white"/>
-        </w:rPr>
-        <w:t xml:space="preserve">, </w:t>
-      </w:r>
-      <w:r>
-        <w:rPr>
-          <w:rFonts w:ascii="Cascadia Mono" w:hAnsi="Cascadia Mono"/>
-          <w:color w:val="6F008A"/>
-          <w:sz w:val="19"/>
-          <w:highlight w:val="white"/>
-        </w:rPr>
-        <w:t>TRUE</w:t>
-      </w:r>
-      <w:r>
-        <w:rPr>
-          <w:rFonts w:ascii="Cascadia Mono" w:hAnsi="Cascadia Mono"/>
-          <w:color w:val="000000"/>
-          <w:sz w:val="19"/>
-          <w:highlight w:val="white"/>
-        </w:rPr>
-        <w:t>);</w:t>
-      </w:r>
-    </w:p>
-    <w:p>
-      <w:pPr>
-        <w:pStyle w:val="Normal"/>
-        <w:rPr>
-          <w:rFonts w:ascii="Cascadia Mono" w:hAnsi="Cascadia Mono"/>
-          <w:color w:val="000000"/>
-          <w:sz w:val="19"/>
-          <w:highlight w:val="white"/>
-        </w:rPr>
-      </w:pPr>
-      <w:r>
-        <w:rPr>
-          <w:rFonts w:ascii="Cascadia Mono" w:hAnsi="Cascadia Mono"/>
-          <w:color w:val="000000"/>
-          <w:sz w:val="19"/>
-          <w:highlight w:val="white"/>
-        </w:rPr>
-        <w:tab/>
         <w:t>}</w:t>
       </w:r>
     </w:p>
@@ -17726,7 +17650,43 @@
           <w:sz w:val="19"/>
           <w:highlight w:val="white"/>
         </w:rPr>
-        <w:t>(255, 128, 0));</w:t>
+        <w:t>(</w:t>
+      </w:r>
+      <w:r>
+        <w:rPr>
+          <w:rFonts w:ascii="Cascadia Mono" w:hAnsi="Cascadia Mono"/>
+          <w:color w:val="000000"/>
+          <w:sz w:val="19"/>
+          <w:highlight w:val="white"/>
+        </w:rPr>
+        <w:t>0</w:t>
+      </w:r>
+      <w:r>
+        <w:rPr>
+          <w:rFonts w:ascii="Cascadia Mono" w:hAnsi="Cascadia Mono"/>
+          <w:color w:val="000000"/>
+          <w:sz w:val="19"/>
+          <w:highlight w:val="white"/>
+        </w:rPr>
+        <w:t xml:space="preserve">, </w:t>
+      </w:r>
+      <w:r>
+        <w:rPr>
+          <w:rFonts w:ascii="Cascadia Mono" w:hAnsi="Cascadia Mono"/>
+          <w:color w:val="000000"/>
+          <w:sz w:val="19"/>
+          <w:highlight w:val="white"/>
+        </w:rPr>
+        <w:t>0</w:t>
+      </w:r>
+      <w:r>
+        <w:rPr>
+          <w:rFonts w:ascii="Cascadia Mono" w:hAnsi="Cascadia Mono"/>
+          <w:color w:val="000000"/>
+          <w:sz w:val="19"/>
+          <w:highlight w:val="white"/>
+        </w:rPr>
+        <w:t>, 0));</w:t>
       </w:r>
     </w:p>
     <w:p>
@@ -28482,14 +28442,14 @@
       <w:lang w:val="en-US" w:eastAsia="zh-CN" w:bidi="hi-IN"/>
     </w:rPr>
   </w:style>
-  <w:style w:type="character" w:styleId="user">
-    <w:name w:val="Маркери (user)"/>
+  <w:style w:type="character" w:styleId="Style14">
+    <w:name w:val="Маркери"/>
     <w:qFormat/>
     <w:rPr>
       <w:rFonts w:ascii="OpenSymbol" w:hAnsi="OpenSymbol" w:eastAsia="OpenSymbol" w:cs="OpenSymbol"/>
     </w:rPr>
   </w:style>
-  <w:style w:type="paragraph" w:styleId="Style14">
+  <w:style w:type="paragraph" w:styleId="Style15">
     <w:name w:val="Заголовок"/>
     <w:basedOn w:val="Normal"/>
     <w:next w:val="BodyText"/>
@@ -28499,7 +28459,7 @@
       <w:spacing w:before="240" w:after="120"/>
     </w:pPr>
     <w:rPr>
-      <w:rFonts w:ascii="Liberation Sans" w:hAnsi="Liberation Sans" w:eastAsia="Microsoft YaHei" w:cs="Arial"/>
+      <w:rFonts w:ascii="Liberation Sans" w:hAnsi="Liberation Sans" w:eastAsia="Clear Sans" w:cs="Noto Sans Devanagari"/>
       <w:sz w:val="28"/>
       <w:szCs w:val="28"/>
     </w:rPr>
@@ -28536,7 +28496,7 @@
       <w:szCs w:val="24"/>
     </w:rPr>
   </w:style>
-  <w:style w:type="paragraph" w:styleId="Style15">
+  <w:style w:type="paragraph" w:styleId="Style16">
     <w:name w:val="Покажчик"/>
     <w:basedOn w:val="Normal"/>
     <w:qFormat/>
@@ -28544,10 +28504,10 @@
       <w:suppressLineNumbers/>
     </w:pPr>
     <w:rPr>
-      <w:rFonts w:cs="Arial"/>
+      <w:rFonts w:cs="Noto Sans Devanagari"/>
     </w:rPr>
   </w:style>
-  <w:style w:type="paragraph" w:styleId="user1">
+  <w:style w:type="paragraph" w:styleId="user">
     <w:name w:val="Заголовок (user)"/>
     <w:basedOn w:val="Normal"/>
     <w:next w:val="BodyText"/>
@@ -28557,12 +28517,12 @@
       <w:spacing w:before="240" w:after="120"/>
     </w:pPr>
     <w:rPr>
-      <w:rFonts w:ascii="Liberation Sans" w:hAnsi="Liberation Sans" w:eastAsia="Clear Sans" w:cs="Noto Sans Devanagari"/>
+      <w:rFonts w:ascii="Liberation Sans" w:hAnsi="Liberation Sans" w:eastAsia="Microsoft YaHei" w:cs="Arial"/>
       <w:sz w:val="28"/>
       <w:szCs w:val="28"/>
     </w:rPr>
   </w:style>
-  <w:style w:type="paragraph" w:styleId="user2">
+  <w:style w:type="paragraph" w:styleId="user1">
     <w:name w:val="Покажчик (user)"/>
     <w:basedOn w:val="Normal"/>
     <w:qFormat/>
@@ -28570,7 +28530,7 @@
       <w:suppressLineNumbers/>
     </w:pPr>
     <w:rPr>
-      <w:rFonts w:cs="Noto Sans Devanagari"/>
+      <w:rFonts w:cs="Arial"/>
     </w:rPr>
   </w:style>
 </w:styles>

</xml_diff>